<commit_message>
Configure Prisma and apply initial database migration
</commit_message>
<xml_diff>
--- a/03_System_Analysis/Use_Cases/ANUJNA Use Case catalog.docx
+++ b/03_System_Analysis/Use_Cases/ANUJNA Use Case catalog.docx
@@ -1131,11 +1131,11 @@
     <w:tbl>
       <w:tblPr>
         <w:tblStyle w:val="TableGrid"/>
-        <w:tblW w:w="9342" w:type="dxa"/>
+        <w:tblW w:w="9570" w:type="dxa"/>
         <w:tblLook w:val="04A0" w:firstRow="1" w:lastRow="0" w:firstColumn="1" w:lastColumn="0" w:noHBand="0" w:noVBand="1"/>
       </w:tblPr>
       <w:tblGrid>
-        <w:gridCol w:w="807"/>
+        <w:gridCol w:w="1035"/>
         <w:gridCol w:w="3535"/>
         <w:gridCol w:w="1613"/>
         <w:gridCol w:w="3387"/>
@@ -1143,7 +1143,7 @@
       <w:tr>
         <w:tc>
           <w:tcPr>
-            <w:tcW w:w="807" w:type="dxa"/>
+            <w:tcW w:w="1035" w:type="dxa"/>
             <w:hideMark/>
           </w:tcPr>
           <w:p>
@@ -1237,7 +1237,7 @@
       <w:tr>
         <w:tc>
           <w:tcPr>
-            <w:tcW w:w="807" w:type="dxa"/>
+            <w:tcW w:w="1035" w:type="dxa"/>
             <w:hideMark/>
           </w:tcPr>
           <w:p>
@@ -1315,7 +1315,7 @@
       <w:tr>
         <w:tc>
           <w:tcPr>
-            <w:tcW w:w="807" w:type="dxa"/>
+            <w:tcW w:w="1035" w:type="dxa"/>
             <w:hideMark/>
           </w:tcPr>
           <w:p>
@@ -1393,7 +1393,7 @@
       <w:tr>
         <w:tc>
           <w:tcPr>
-            <w:tcW w:w="807" w:type="dxa"/>
+            <w:tcW w:w="1035" w:type="dxa"/>
             <w:hideMark/>
           </w:tcPr>
           <w:p>
@@ -1471,7 +1471,7 @@
       <w:tr>
         <w:tc>
           <w:tcPr>
-            <w:tcW w:w="807" w:type="dxa"/>
+            <w:tcW w:w="1035" w:type="dxa"/>
             <w:hideMark/>
           </w:tcPr>
           <w:p>
@@ -1549,7 +1549,7 @@
       <w:tr>
         <w:tc>
           <w:tcPr>
-            <w:tcW w:w="807" w:type="dxa"/>
+            <w:tcW w:w="1035" w:type="dxa"/>
             <w:hideMark/>
           </w:tcPr>
           <w:p>
@@ -1627,7 +1627,7 @@
       <w:tr>
         <w:tc>
           <w:tcPr>
-            <w:tcW w:w="807" w:type="dxa"/>
+            <w:tcW w:w="1035" w:type="dxa"/>
             <w:hideMark/>
           </w:tcPr>
           <w:p>
@@ -1705,7 +1705,7 @@
       <w:tr>
         <w:tc>
           <w:tcPr>
-            <w:tcW w:w="807" w:type="dxa"/>
+            <w:tcW w:w="1035" w:type="dxa"/>
             <w:hideMark/>
           </w:tcPr>
           <w:p>
@@ -1781,6 +1781,20 @@
         </w:tc>
       </w:tr>
     </w:tbl>
+    <w:p>
+      <w:pPr>
+        <w:rPr>
+          <w:rFonts w:ascii="Times New Roman" w:hAnsi="Times New Roman" w:cs="Times New Roman"/>
+        </w:rPr>
+      </w:pPr>
+    </w:p>
+    <w:p>
+      <w:pPr>
+        <w:rPr>
+          <w:rFonts w:ascii="Times New Roman" w:hAnsi="Times New Roman" w:cs="Times New Roman"/>
+        </w:rPr>
+      </w:pPr>
+    </w:p>
     <w:p>
       <w:pPr>
         <w:rPr>

</xml_diff>